<commit_message>
improve code quality : added k_omega, sst, compare toggles.
</commit_message>
<xml_diff>
--- a/Report.docx
+++ b/Report.docx
@@ -545,13 +545,7 @@
           <w:rPr>
             <w:rFonts w:ascii="Cambria Math" w:hAnsi="Cambria Math" w:cs="Times New Roman"/>
           </w:rPr>
-          <m:t>ω</m:t>
-        </m:r>
-        <m:r>
-          <w:rPr>
-            <w:rFonts w:ascii="Cambria Math" w:hAnsi="Cambria Math" w:cs="Times New Roman"/>
-          </w:rPr>
-          <m:t xml:space="preserve"> </m:t>
+          <m:t xml:space="preserve">ω </m:t>
         </m:r>
       </m:oMath>
       <w:r>
@@ -600,13 +594,7 @@
           <w:rPr>
             <w:rFonts w:ascii="Cambria Math" w:hAnsi="Cambria Math" w:cs="Times New Roman"/>
           </w:rPr>
-          <m:t>k</m:t>
-        </m:r>
-        <m:r>
-          <w:rPr>
-            <w:rFonts w:ascii="Cambria Math" w:hAnsi="Cambria Math" w:cs="Times New Roman"/>
-          </w:rPr>
-          <m:t xml:space="preserve"> </m:t>
+          <m:t xml:space="preserve">k </m:t>
         </m:r>
       </m:oMath>
       <w:r>
@@ -620,13 +608,7 @@
           <w:rPr>
             <w:rFonts w:ascii="Cambria Math" w:hAnsi="Cambria Math" w:cs="Times New Roman"/>
           </w:rPr>
-          <m:t>ω</m:t>
-        </m:r>
-        <m:r>
-          <w:rPr>
-            <w:rFonts w:ascii="Cambria Math" w:hAnsi="Cambria Math" w:cs="Times New Roman"/>
-          </w:rPr>
-          <m:t xml:space="preserve"> </m:t>
+          <m:t xml:space="preserve">ω </m:t>
         </m:r>
       </m:oMath>
       <w:r>
@@ -640,13 +622,7 @@
           <w:rPr>
             <w:rFonts w:ascii="Cambria Math" w:hAnsi="Cambria Math" w:cs="Times New Roman"/>
           </w:rPr>
-          <m:t>k</m:t>
-        </m:r>
-        <m:r>
-          <w:rPr>
-            <w:rFonts w:ascii="Cambria Math" w:hAnsi="Cambria Math" w:cs="Times New Roman"/>
-          </w:rPr>
-          <m:t xml:space="preserve"> </m:t>
+          <m:t xml:space="preserve">k </m:t>
         </m:r>
       </m:oMath>
       <w:r>
@@ -841,13 +817,7 @@
           <w:rPr>
             <w:rFonts w:ascii="Cambria Math" w:hAnsi="Cambria Math" w:cs="Times New Roman"/>
           </w:rPr>
-          <m:t>ω</m:t>
-        </m:r>
-        <m:r>
-          <w:rPr>
-            <w:rFonts w:ascii="Cambria Math" w:hAnsi="Cambria Math" w:cs="Times New Roman"/>
-          </w:rPr>
-          <m:t xml:space="preserve"> </m:t>
+          <m:t xml:space="preserve">ω </m:t>
         </m:r>
       </m:oMath>
       <w:r>
@@ -1346,7 +1316,6 @@
           <m:r>
             <w:rPr>
               <w:rFonts w:ascii="Times New Roman" w:hAnsi="Times New Roman" w:cs="Times New Roman"/>
-              <w:i/>
             </w:rPr>
             <w:br/>
           </m:r>
@@ -1468,13 +1437,7 @@
           <w:rPr>
             <w:rFonts w:ascii="Cambria Math" w:hAnsi="Cambria Math" w:cs="Times New Roman"/>
           </w:rPr>
-          <m:t>k</m:t>
-        </m:r>
-        <m:r>
-          <w:rPr>
-            <w:rFonts w:ascii="Cambria Math" w:hAnsi="Cambria Math" w:cs="Times New Roman"/>
-          </w:rPr>
-          <m:t xml:space="preserve"> </m:t>
+          <m:t xml:space="preserve">k </m:t>
         </m:r>
       </m:oMath>
       <w:r>
@@ -1488,13 +1451,7 @@
           <w:rPr>
             <w:rFonts w:ascii="Cambria Math" w:hAnsi="Cambria Math" w:cs="Times New Roman"/>
           </w:rPr>
-          <m:t>ω</m:t>
-        </m:r>
-        <m:r>
-          <w:rPr>
-            <w:rFonts w:ascii="Cambria Math" w:hAnsi="Cambria Math" w:cs="Times New Roman"/>
-          </w:rPr>
-          <m:t xml:space="preserve"> </m:t>
+          <m:t xml:space="preserve">ω </m:t>
         </m:r>
       </m:oMath>
       <w:r>
@@ -1623,6 +1580,9 @@
             <m:t>,</m:t>
           </m:r>
           <m:r>
+            <m:rPr>
+              <m:sty m:val="p"/>
+            </m:rPr>
             <w:rPr>
               <w:rFonts w:ascii="Times New Roman" w:hAnsi="Times New Roman" w:cs="Times New Roman"/>
             </w:rPr>
@@ -1940,6 +1900,9 @@
             </m:sup>
           </m:sSup>
           <m:r>
+            <m:rPr>
+              <m:sty m:val="p"/>
+            </m:rPr>
             <w:rPr>
               <w:rFonts w:ascii="Times New Roman" w:hAnsi="Times New Roman" w:cs="Times New Roman"/>
             </w:rPr>
@@ -2061,6 +2024,9 @@
             </m:sup>
           </m:sSup>
           <m:r>
+            <m:rPr>
+              <m:sty m:val="p"/>
+            </m:rPr>
             <w:rPr>
               <w:rFonts w:ascii="Times New Roman" w:hAnsi="Times New Roman" w:cs="Times New Roman"/>
             </w:rPr>
@@ -2956,13 +2922,7 @@
                     <w:rPr>
                       <w:rFonts w:ascii="Cambria Math" w:hAnsi="Cambria Math" w:cs="Times New Roman"/>
                     </w:rPr>
-                    <m:t> </m:t>
-                  </m:r>
-                  <m:r>
-                    <w:rPr>
-                      <w:rFonts w:ascii="Cambria Math" w:hAnsi="Cambria Math" w:cs="Times New Roman"/>
-                    </w:rPr>
-                    <m:t>I</m:t>
+                    <m:t> I</m:t>
                   </m:r>
                   <m:ctrlPr>
                     <w:rPr>
@@ -3102,13 +3062,7 @@
                 <w:rPr>
                   <w:rFonts w:ascii="Cambria Math" w:hAnsi="Cambria Math" w:cs="Times New Roman"/>
                 </w:rPr>
-                <m:t> </m:t>
-              </m:r>
-              <m:r>
-                <w:rPr>
-                  <w:rFonts w:ascii="Cambria Math" w:hAnsi="Cambria Math" w:cs="Times New Roman"/>
-                </w:rPr>
-                <m:t>L</m:t>
+                <m:t> L</m:t>
               </m:r>
               <m:ctrlPr>
                 <w:rPr>
@@ -3125,6 +3079,9 @@
             <m:t>.</m:t>
           </m:r>
           <m:r>
+            <m:rPr>
+              <m:sty m:val="p"/>
+            </m:rPr>
             <w:rPr>
               <w:rFonts w:ascii="Times New Roman" w:hAnsi="Times New Roman" w:cs="Times New Roman"/>
             </w:rPr>
@@ -3546,16 +3503,7 @@
           <w:rPr>
             <w:rFonts w:ascii="Cambria Math" w:hAnsi="Cambria Math" w:cs="Times New Roman"/>
           </w:rPr>
-          <m:t>≤</m:t>
-        </m:r>
-        <m:r>
-          <m:rPr>
-            <m:sty m:val="p"/>
-          </m:rPr>
-          <w:rPr>
-            <w:rFonts w:ascii="Cambria Math" w:hAnsi="Cambria Math" w:cs="Times New Roman"/>
-          </w:rPr>
-          <m:t>Δ</m:t>
+          <m:t>≤Δ</m:t>
         </m:r>
         <m:sSub>
           <m:sSubPr>
@@ -3628,6 +3576,7 @@
             </m:ctrlPr>
           </m:sSubPr>
           <m:e>
+            <w:proofErr w:type="spellStart"/>
             <m:r>
               <m:rPr>
                 <m:nor/>
@@ -3637,6 +3586,7 @@
               </w:rPr>
               <m:t>CFL</m:t>
             </m:r>
+            <w:proofErr w:type="spellEnd"/>
           </m:e>
           <m:sub>
             <m:r>
@@ -4810,7 +4760,29 @@
                 <w:szCs w:val="20"/>
                 <w14:ligatures w14:val="none"/>
               </w:rPr>
-              <w:t>(Nx × Ny)</w:t>
+              <w:t>(</w:t>
+            </w:r>
+            <w:proofErr w:type="spellStart"/>
+            <w:r>
+              <w:rPr>
+                <w:rFonts w:ascii="Times New Roman" w:eastAsia="Times New Roman" w:hAnsi="Times New Roman" w:cs="Times New Roman"/>
+                <w:kern w:val="0"/>
+                <w:sz w:val="20"/>
+                <w:szCs w:val="20"/>
+                <w14:ligatures w14:val="none"/>
+              </w:rPr>
+              <w:t>Nx</w:t>
+            </w:r>
+            <w:proofErr w:type="spellEnd"/>
+            <w:r>
+              <w:rPr>
+                <w:rFonts w:ascii="Times New Roman" w:eastAsia="Times New Roman" w:hAnsi="Times New Roman" w:cs="Times New Roman"/>
+                <w:kern w:val="0"/>
+                <w:sz w:val="20"/>
+                <w:szCs w:val="20"/>
+                <w14:ligatures w14:val="none"/>
+              </w:rPr>
+              <w:t xml:space="preserve"> × Ny)</w:t>
             </w:r>
           </w:p>
         </w:tc>
@@ -4833,7 +4805,79 @@
                 <w:kern w:val="0"/>
                 <w14:ligatures w14:val="none"/>
               </w:rPr>
-              <w:t>[cfl, cfl_diff, dt_max, max_steps]</w:t>
+              <w:t>[</w:t>
+            </w:r>
+            <w:proofErr w:type="spellStart"/>
+            <w:r>
+              <w:rPr>
+                <w:rFonts w:ascii="Times New Roman" w:eastAsia="Times New Roman" w:hAnsi="Times New Roman" w:cs="Times New Roman"/>
+                <w:kern w:val="0"/>
+                <w14:ligatures w14:val="none"/>
+              </w:rPr>
+              <w:t>cfl</w:t>
+            </w:r>
+            <w:proofErr w:type="spellEnd"/>
+            <w:r>
+              <w:rPr>
+                <w:rFonts w:ascii="Times New Roman" w:eastAsia="Times New Roman" w:hAnsi="Times New Roman" w:cs="Times New Roman"/>
+                <w:kern w:val="0"/>
+                <w14:ligatures w14:val="none"/>
+              </w:rPr>
+              <w:t xml:space="preserve">, </w:t>
+            </w:r>
+            <w:proofErr w:type="spellStart"/>
+            <w:r>
+              <w:rPr>
+                <w:rFonts w:ascii="Times New Roman" w:eastAsia="Times New Roman" w:hAnsi="Times New Roman" w:cs="Times New Roman"/>
+                <w:kern w:val="0"/>
+                <w14:ligatures w14:val="none"/>
+              </w:rPr>
+              <w:t>cfl_diff</w:t>
+            </w:r>
+            <w:proofErr w:type="spellEnd"/>
+            <w:r>
+              <w:rPr>
+                <w:rFonts w:ascii="Times New Roman" w:eastAsia="Times New Roman" w:hAnsi="Times New Roman" w:cs="Times New Roman"/>
+                <w:kern w:val="0"/>
+                <w14:ligatures w14:val="none"/>
+              </w:rPr>
+              <w:t xml:space="preserve">, </w:t>
+            </w:r>
+            <w:proofErr w:type="spellStart"/>
+            <w:r>
+              <w:rPr>
+                <w:rFonts w:ascii="Times New Roman" w:eastAsia="Times New Roman" w:hAnsi="Times New Roman" w:cs="Times New Roman"/>
+                <w:kern w:val="0"/>
+                <w14:ligatures w14:val="none"/>
+              </w:rPr>
+              <w:t>dt_max</w:t>
+            </w:r>
+            <w:proofErr w:type="spellEnd"/>
+            <w:r>
+              <w:rPr>
+                <w:rFonts w:ascii="Times New Roman" w:eastAsia="Times New Roman" w:hAnsi="Times New Roman" w:cs="Times New Roman"/>
+                <w:kern w:val="0"/>
+                <w14:ligatures w14:val="none"/>
+              </w:rPr>
+              <w:t xml:space="preserve">, </w:t>
+            </w:r>
+            <w:proofErr w:type="spellStart"/>
+            <w:r>
+              <w:rPr>
+                <w:rFonts w:ascii="Times New Roman" w:eastAsia="Times New Roman" w:hAnsi="Times New Roman" w:cs="Times New Roman"/>
+                <w:kern w:val="0"/>
+                <w14:ligatures w14:val="none"/>
+              </w:rPr>
+              <w:t>max_steps</w:t>
+            </w:r>
+            <w:proofErr w:type="spellEnd"/>
+            <w:r>
+              <w:rPr>
+                <w:rFonts w:ascii="Times New Roman" w:eastAsia="Times New Roman" w:hAnsi="Times New Roman" w:cs="Times New Roman"/>
+                <w:kern w:val="0"/>
+                <w14:ligatures w14:val="none"/>
+              </w:rPr>
+              <w:t>]</w:t>
             </w:r>
           </w:p>
         </w:tc>
@@ -5443,7 +5487,6 @@
     <w:p>
       <w:pPr>
         <w:rPr>
-          <w:rStyle w:val="Normal"/>
           <w:rFonts w:ascii="Times New Roman" w:eastAsia="Times New Roman" w:hAnsi="Times New Roman" w:cs="Times New Roman"/>
           <w:snapToGrid w:val="0"/>
           <w:color w:val="000000"/>
@@ -5949,6 +5992,7 @@
       <w:r>
         <w:rPr>
           <w:rFonts w:ascii="Times New Roman" w:eastAsia="Times New Roman" w:hAnsi="Times New Roman" w:cs="Times New Roman"/>
+          <w:noProof/>
           <w:kern w:val="0"/>
           <w14:ligatures w14:val="none"/>
         </w:rPr>
@@ -6293,7 +6337,18 @@
           <w:kern w:val="0"/>
           <w14:ligatures w14:val="none"/>
         </w:rPr>
-        <w:t>The converged solution shows the expected fully developed turbulent channel features. The mean streamwise velocity profile is noticeably flatter than the laminar parabolic profile, with the maximum velocity occurring at the symmetry boundary (</w:t>
+        <w:t>The converged solution shows the expected fully developed turbulent channel features</w:t>
+      </w:r>
+      <w:r>
+        <w:t xml:space="preserve"> </w:t>
+      </w:r>
+      <w:r>
+        <w:rPr>
+          <w:rFonts w:ascii="Times New Roman" w:eastAsia="Times New Roman" w:hAnsi="Times New Roman" w:cs="Times New Roman"/>
+          <w:kern w:val="0"/>
+          <w14:ligatures w14:val="none"/>
+        </w:rPr>
+        <w:t>The streamwise velocity field (Figure 3, u.png) and the mean profile (Figure 5, u_line.png) exhibit much steeper near-wall velocity gradient compared to laminar flow, and a maximum velocity at the symmetry boundary (</w:t>
       </w:r>
       <m:oMath>
         <m:r>
@@ -6302,7 +6357,18 @@
             <w:kern w:val="0"/>
             <w14:ligatures w14:val="none"/>
           </w:rPr>
-          <m:t>y=0.05</m:t>
+          <m:t>y</m:t>
+        </m:r>
+        <m:r>
+          <m:rPr>
+            <m:sty m:val="p"/>
+          </m:rPr>
+          <w:rPr>
+            <w:rFonts w:ascii="Cambria Math" w:eastAsia="Times New Roman" w:hAnsi="Cambria Math" w:cs="Times New Roman"/>
+            <w:kern w:val="0"/>
+            <w14:ligatures w14:val="none"/>
+          </w:rPr>
+          <m:t>=0.05</m:t>
         </m:r>
         <m:r>
           <m:rPr>
@@ -6313,7 +6379,18 @@
             <w:kern w:val="0"/>
             <w14:ligatures w14:val="none"/>
           </w:rPr>
-          <m:t xml:space="preserve"> m</m:t>
+          <m:t> </m:t>
+        </m:r>
+        <m:r>
+          <m:rPr>
+            <m:sty m:val="p"/>
+          </m:rPr>
+          <w:rPr>
+            <w:rFonts w:ascii="Cambria Math" w:eastAsia="Times New Roman" w:hAnsi="Cambria Math" w:cs="Times New Roman"/>
+            <w:kern w:val="0"/>
+            <w14:ligatures w14:val="none"/>
+          </w:rPr>
+          <m:t>m</m:t>
         </m:r>
       </m:oMath>
       <w:r>
@@ -6322,7 +6399,7 @@
           <w:kern w:val="0"/>
           <w14:ligatures w14:val="none"/>
         </w:rPr>
-        <w:t>). The transverse velocity remains negligible relative to the streamwise component (</w:t>
+        <w:t>). The transverse velocity field (Figure 7, v.png) remains negligible relative to the streamwise component (</w:t>
       </w:r>
       <m:oMath>
         <m:r>
@@ -6353,26 +6430,7 @@
             <w:kern w:val="0"/>
             <w14:ligatures w14:val="none"/>
           </w:rPr>
-          <m:t>∣</m:t>
-        </m:r>
-        <m:r>
-          <w:rPr>
-            <w:rFonts w:ascii="Cambria Math" w:eastAsia="Times New Roman" w:hAnsi="Cambria Math" w:cs="Times New Roman"/>
-            <w:kern w:val="0"/>
-            <w14:ligatures w14:val="none"/>
-          </w:rPr>
-          <m:t>≪</m:t>
-        </m:r>
-        <m:r>
-          <m:rPr>
-            <m:sty m:val="p"/>
-          </m:rPr>
-          <w:rPr>
-            <w:rFonts w:ascii="Cambria Math" w:eastAsia="Times New Roman" w:hAnsi="Cambria Math" w:cs="Times New Roman"/>
-            <w:kern w:val="0"/>
-            <w14:ligatures w14:val="none"/>
-          </w:rPr>
-          <m:t>∣</m:t>
+          <m:t>∣≪∣</m:t>
         </m:r>
         <m:r>
           <w:rPr>
@@ -6400,7 +6458,52 @@
           <w:kern w:val="0"/>
           <w14:ligatures w14:val="none"/>
         </w:rPr>
-        <w:t xml:space="preserve">), supporting a quasi-1D fully developed mean flow. The pressure field is included as a qualitative check that the imposed pressure-gradient forcing is being applied consistently and that no nonphysical pressure structure develops. Near-wall resolution is assessed using the </w:t>
+        <w:t xml:space="preserve">), supporting a quasi-1D fully developed mean flow with no sustained secondary motion. The pressure contour (Figure 4, p.png) is included as a qualitative check of solution behavior under the imposed </w:t>
+      </w:r>
+      <m:oMath>
+        <m:r>
+          <w:rPr>
+            <w:rFonts w:ascii="Cambria Math" w:eastAsia="Times New Roman" w:hAnsi="Cambria Math" w:cs="Times New Roman"/>
+            <w:kern w:val="0"/>
+            <w14:ligatures w14:val="none"/>
+          </w:rPr>
+          <m:t>dp</m:t>
+        </m:r>
+        <m:r>
+          <m:rPr>
+            <m:sty m:val="p"/>
+          </m:rPr>
+          <w:rPr>
+            <w:rFonts w:ascii="Cambria Math" w:eastAsia="Times New Roman" w:hAnsi="Cambria Math" w:cs="Times New Roman"/>
+            <w:kern w:val="0"/>
+            <w14:ligatures w14:val="none"/>
+          </w:rPr>
+          <m:t>/</m:t>
+        </m:r>
+        <m:r>
+          <w:rPr>
+            <w:rFonts w:ascii="Cambria Math" w:eastAsia="Times New Roman" w:hAnsi="Cambria Math" w:cs="Times New Roman"/>
+            <w:kern w:val="0"/>
+            <w14:ligatures w14:val="none"/>
+          </w:rPr>
+          <m:t>dx</m:t>
+        </m:r>
+        <m:r>
+          <w:rPr>
+            <w:rFonts w:ascii="Cambria Math" w:eastAsia="Times New Roman" w:hAnsi="Cambria Math" w:cs="Times New Roman"/>
+            <w:kern w:val="0"/>
+            <w14:ligatures w14:val="none"/>
+          </w:rPr>
+          <m:t xml:space="preserve"> </m:t>
+        </m:r>
+      </m:oMath>
+      <w:r>
+        <w:rPr>
+          <w:rFonts w:ascii="Times New Roman" w:eastAsia="Times New Roman" w:hAnsi="Times New Roman" w:cs="Times New Roman"/>
+          <w:kern w:val="0"/>
+          <w14:ligatures w14:val="none"/>
+        </w:rPr>
+        <w:t xml:space="preserve">forcing. Near-wall resolution is assessed using the </w:t>
       </w:r>
       <m:oMath>
         <m:sSup>
@@ -6425,6 +6528,9 @@
           </m:e>
           <m:sup>
             <m:r>
+              <m:rPr>
+                <m:sty m:val="p"/>
+              </m:rPr>
               <w:rPr>
                 <w:rFonts w:ascii="Cambria Math" w:eastAsia="Times New Roman" w:hAnsi="Cambria Math" w:cs="Times New Roman"/>
                 <w:kern w:val="0"/>
@@ -6441,7 +6547,7 @@
           <w:kern w:val="0"/>
           <w14:ligatures w14:val="none"/>
         </w:rPr>
-        <w:t xml:space="preserve">diagnostic; the first-cell value on the Medium mesh is approximately </w:t>
+        <w:t xml:space="preserve">diagnostic (Figure 6, yplus.png); on the Medium mesh the first-cell value is approximately </w:t>
       </w:r>
       <m:oMath>
         <m:sSup>
@@ -6466,6 +6572,9 @@
           </m:e>
           <m:sup>
             <m:r>
+              <m:rPr>
+                <m:sty m:val="p"/>
+              </m:rPr>
               <w:rPr>
                 <w:rFonts w:ascii="Cambria Math" w:eastAsia="Times New Roman" w:hAnsi="Cambria Math" w:cs="Times New Roman"/>
                 <w:kern w:val="0"/>
@@ -6476,6 +6585,9 @@
           </m:sup>
         </m:sSup>
         <m:r>
+          <m:rPr>
+            <m:sty m:val="p"/>
+          </m:rPr>
           <w:rPr>
             <w:rFonts w:ascii="Cambria Math" w:eastAsia="Times New Roman" w:hAnsi="Cambria Math" w:cs="Times New Roman"/>
             <w:kern w:val="0"/>
@@ -6490,31 +6602,32 @@
           <w:kern w:val="0"/>
           <w14:ligatures w14:val="none"/>
         </w:rPr>
-        <w:t>.</w:t>
-      </w:r>
-    </w:p>
-    <w:p>
-      <w:pPr>
-        <w:rPr>
-          <w:rFonts w:ascii="Times New Roman" w:eastAsia="Times New Roman" w:hAnsi="Times New Roman" w:cs="Times New Roman"/>
-          <w:kern w:val="0"/>
-          <w14:ligatures w14:val="none"/>
-        </w:rPr>
-      </w:pPr>
-      <w:r>
-        <w:rPr>
-          <w:rFonts w:ascii="Times New Roman" w:eastAsia="Times New Roman" w:hAnsi="Times New Roman" w:cs="Times New Roman"/>
+        <w:t>, indicating that the wall region is near the intended resolution level for the present setup.</w:t>
+      </w:r>
+    </w:p>
+    <w:p>
+      <w:pPr>
+        <w:rPr>
+          <w:rFonts w:ascii="Times New Roman" w:eastAsia="Times New Roman" w:hAnsi="Times New Roman" w:cs="Times New Roman"/>
+          <w:kern w:val="0"/>
+          <w14:ligatures w14:val="none"/>
+        </w:rPr>
+      </w:pPr>
+      <w:r>
+        <w:rPr>
+          <w:rFonts w:ascii="Times New Roman" w:eastAsia="Times New Roman" w:hAnsi="Times New Roman" w:cs="Times New Roman"/>
+          <w:noProof/>
           <w:kern w:val="0"/>
           <w14:ligatures w14:val="none"/>
         </w:rPr>
         <w:drawing>
-          <wp:anchor distT="0" distB="0" distL="114300" distR="114300" simplePos="0" relativeHeight="251662336" behindDoc="0" locked="0" layoutInCell="1" allowOverlap="1" wp14:anchorId="7B51340D" wp14:editId="6B5F4A3B">
+          <wp:anchor distT="0" distB="0" distL="114300" distR="114300" simplePos="0" relativeHeight="251662336" behindDoc="0" locked="0" layoutInCell="1" allowOverlap="1" wp14:anchorId="7B51340D" wp14:editId="3347B37E">
             <wp:simplePos x="0" y="0"/>
             <wp:positionH relativeFrom="margin">
-              <wp:align>center</wp:align>
+              <wp:posOffset>1189073</wp:posOffset>
             </wp:positionH>
             <wp:positionV relativeFrom="paragraph">
-              <wp:posOffset>294802</wp:posOffset>
+              <wp:posOffset>12997</wp:posOffset>
             </wp:positionV>
             <wp:extent cx="3657600" cy="2743200"/>
             <wp:effectExtent l="0" t="0" r="0" b="0"/>
@@ -6629,24 +6742,6 @@
     </w:p>
     <w:p>
       <w:pPr>
-        <w:rPr>
-          <w:rFonts w:ascii="Times New Roman" w:eastAsia="Times New Roman" w:hAnsi="Times New Roman" w:cs="Times New Roman"/>
-          <w:kern w:val="0"/>
-          <w14:ligatures w14:val="none"/>
-        </w:rPr>
-      </w:pPr>
-    </w:p>
-    <w:p>
-      <w:pPr>
-        <w:rPr>
-          <w:rFonts w:ascii="Times New Roman" w:eastAsia="Times New Roman" w:hAnsi="Times New Roman" w:cs="Times New Roman"/>
-          <w:kern w:val="0"/>
-          <w14:ligatures w14:val="none"/>
-        </w:rPr>
-      </w:pPr>
-    </w:p>
-    <w:p>
-      <w:pPr>
         <w:jc w:val="center"/>
         <w:rPr>
           <w:rFonts w:ascii="Times New Roman" w:eastAsia="Times New Roman" w:hAnsi="Times New Roman" w:cs="Times New Roman"/>
@@ -6672,6 +6767,7 @@
           <w:szCs w:val="20"/>
           <w14:ligatures w14:val="none"/>
         </w:rPr>
+        <w:lastRenderedPageBreak/>
         <w:t xml:space="preserve">Figure 3: Contour plot of streamwise velocity, </w:t>
       </w:r>
       <m:oMath>
@@ -6742,6 +6838,7 @@
           <w:bCs/>
           <w:i/>
           <w:iCs/>
+          <w:noProof/>
           <w:kern w:val="0"/>
           <w:sz w:val="20"/>
           <w:szCs w:val="20"/>
@@ -7030,6 +7127,7 @@
           <w:bCs/>
           <w:i/>
           <w:iCs/>
+          <w:noProof/>
           <w:kern w:val="0"/>
           <w:sz w:val="20"/>
           <w:szCs w:val="20"/>
@@ -7456,6 +7554,7 @@
           <w:bCs/>
           <w:i/>
           <w:iCs/>
+          <w:noProof/>
           <w:kern w:val="0"/>
           <w:sz w:val="20"/>
           <w:szCs w:val="20"/>
@@ -7834,7 +7933,7 @@
           <w:szCs w:val="20"/>
           <w14:ligatures w14:val="none"/>
         </w:rPr>
-        <w:t>diagnostic (yplus_v.png).</w:t>
+        <w:t>diagnostic (yplus.png).</w:t>
       </w:r>
     </w:p>
     <w:p>
@@ -7875,6 +7974,7 @@
           <w:bCs/>
           <w:i/>
           <w:iCs/>
+          <w:noProof/>
           <w:kern w:val="0"/>
           <w:sz w:val="20"/>
           <w:szCs w:val="20"/>
@@ -8203,7 +8303,6 @@
     <w:p>
       <w:pPr>
         <w:rPr>
-          <w:rStyle w:val="Normal"/>
           <w:rFonts w:ascii="Times New Roman" w:eastAsia="Times New Roman" w:hAnsi="Times New Roman" w:cs="Times New Roman"/>
           <w:snapToGrid w:val="0"/>
           <w:color w:val="000000"/>
@@ -8222,7 +8321,6 @@
     <w:p>
       <w:pPr>
         <w:rPr>
-          <w:rStyle w:val="Normal"/>
           <w:rFonts w:ascii="Times New Roman" w:eastAsia="Times New Roman" w:hAnsi="Times New Roman" w:cs="Times New Roman"/>
           <w:snapToGrid w:val="0"/>
           <w:color w:val="000000"/>
@@ -8241,7 +8339,6 @@
     <w:p>
       <w:pPr>
         <w:rPr>
-          <w:rStyle w:val="Normal"/>
           <w:rFonts w:ascii="Times New Roman" w:eastAsia="Times New Roman" w:hAnsi="Times New Roman" w:cs="Times New Roman"/>
           <w:snapToGrid w:val="0"/>
           <w:color w:val="000000"/>
@@ -8271,6 +8368,7 @@
           <w:b/>
           <w:bCs/>
         </w:rPr>
+        <w:lastRenderedPageBreak/>
         <w:t>5. Discussion / Bonus Questions</w:t>
       </w:r>
     </w:p>
@@ -8350,6 +8448,12 @@
               </w:rPr>
               <m:t>bulk</m:t>
             </m:r>
+            <m:r>
+              <w:rPr>
+                <w:rFonts w:ascii="Cambria Math" w:hAnsi="Cambria Math" w:cs="Times New Roman"/>
+              </w:rPr>
+              <m:t xml:space="preserve"> </m:t>
+            </m:r>
           </m:sub>
         </m:sSub>
       </m:oMath>
@@ -8365,6 +8469,12 @@
             <w:rFonts w:ascii="Cambria Math" w:hAnsi="Cambria Math" w:cs="Times New Roman"/>
           </w:rPr>
           <m:t>u=0</m:t>
+        </m:r>
+        <m:r>
+          <w:rPr>
+            <w:rFonts w:ascii="Cambria Math" w:hAnsi="Cambria Math" w:cs="Times New Roman"/>
+          </w:rPr>
+          <m:t xml:space="preserve">  </m:t>
         </m:r>
       </m:oMath>
       <w:r>
@@ -8477,6 +8587,12 @@
             </m:r>
           </m:sub>
         </m:sSub>
+        <m:r>
+          <w:rPr>
+            <w:rFonts w:ascii="Cambria Math" w:hAnsi="Cambria Math" w:cs="Times New Roman"/>
+          </w:rPr>
+          <m:t xml:space="preserve"> </m:t>
+        </m:r>
       </m:oMath>
       <w:r>
         <w:rPr>
@@ -8510,6 +8626,12 @@
             </m:r>
           </m:sub>
         </m:sSub>
+        <m:r>
+          <w:rPr>
+            <w:rFonts w:ascii="Cambria Math" w:hAnsi="Cambria Math" w:cs="Times New Roman"/>
+          </w:rPr>
+          <m:t xml:space="preserve"> </m:t>
+        </m:r>
       </m:oMath>
       <w:r>
         <w:rPr>
@@ -8543,6 +8665,12 @@
             </m:r>
           </m:sub>
         </m:sSub>
+        <m:r>
+          <w:rPr>
+            <w:rFonts w:ascii="Cambria Math" w:hAnsi="Cambria Math" w:cs="Times New Roman"/>
+          </w:rPr>
+          <m:t xml:space="preserve"> </m:t>
+        </m:r>
       </m:oMath>
       <w:r>
         <w:rPr>
@@ -8576,12 +8704,30 @@
             </m:r>
           </m:sub>
         </m:sSub>
+        <m:r>
+          <w:rPr>
+            <w:rFonts w:ascii="Cambria Math" w:hAnsi="Cambria Math" w:cs="Times New Roman"/>
+          </w:rPr>
+          <m:t xml:space="preserve"> </m:t>
+        </m:r>
       </m:oMath>
       <w:r>
         <w:rPr>
           <w:rFonts w:ascii="Times New Roman" w:hAnsi="Times New Roman" w:cs="Times New Roman"/>
         </w:rPr>
-        <w:t xml:space="preserve">can be biased high. In this report, the friction-factor bias is attributed primarily to numerical/near-wall sensitivity; a direct </w:t>
+        <w:t>can be biased high. In this report, the friction-factor bias is attributed primarily to numerical</w:t>
+      </w:r>
+      <w:r>
+        <w:rPr>
+          <w:rFonts w:ascii="Times New Roman" w:hAnsi="Times New Roman" w:cs="Times New Roman"/>
+        </w:rPr>
+        <w:t xml:space="preserve"> and </w:t>
+      </w:r>
+      <w:r>
+        <w:rPr>
+          <w:rFonts w:ascii="Times New Roman" w:hAnsi="Times New Roman" w:cs="Times New Roman"/>
+        </w:rPr>
+        <w:t xml:space="preserve">near-wall sensitivity; a direct </w:t>
       </w:r>
       <m:oMath>
         <m:sSub>
@@ -8642,6 +8788,12 @@
             </m:r>
           </m:sub>
         </m:sSub>
+        <m:r>
+          <w:rPr>
+            <w:rFonts w:ascii="Cambria Math" w:hAnsi="Cambria Math" w:cs="Times New Roman"/>
+          </w:rPr>
+          <m:t xml:space="preserve"> </m:t>
+        </m:r>
       </m:oMath>
       <w:r>
         <w:rPr>
@@ -8824,11 +8976,6 @@
       </w:r>
     </w:p>
     <w:p>
-      <w:pPr>
-        <w:rPr>
-          <w:rFonts w:ascii="Times New Roman" w:hAnsi="Times New Roman" w:cs="Times New Roman"/>
-        </w:rPr>
-      </w:pPr>
       <w:r>
         <w:rPr>
           <w:rFonts w:ascii="Times New Roman" w:hAnsi="Times New Roman" w:cs="Times New Roman"/>
@@ -8842,97 +8989,17 @@
           <w:rFonts w:ascii="Times New Roman" w:hAnsi="Times New Roman" w:cs="Times New Roman"/>
         </w:rPr>
         <w:br/>
-        <w:t>The time step controls both stability and the path to steady state. Tighter limits (lower CFL/</w:t>
-      </w:r>
-      <w:r>
-        <w:rPr>
-          <w:rFonts w:ascii="Cambria Math" w:hAnsi="Cambria Math" w:cs="Times New Roman"/>
-        </w:rPr>
-        <w:t xml:space="preserve"> </w:t>
-      </w:r>
-      <m:oMath>
-        <m:sSub>
-          <m:sSubPr>
-            <m:ctrlPr>
-              <w:rPr>
-                <w:rFonts w:ascii="Cambria Math" w:hAnsi="Cambria Math" w:cs="Times New Roman"/>
-              </w:rPr>
-            </m:ctrlPr>
-          </m:sSubPr>
-          <m:e>
-            <m:r>
-              <m:rPr>
-                <m:sty m:val="p"/>
-              </m:rPr>
-              <w:rPr>
-                <w:rFonts w:ascii="Cambria Math" w:hAnsi="Cambria Math" w:cs="Times New Roman"/>
-              </w:rPr>
-              <m:t>CFL</m:t>
-            </m:r>
-          </m:e>
-          <m:sub>
-            <m:r>
-              <w:rPr>
-                <w:rFonts w:ascii="Cambria Math" w:hAnsi="Cambria Math" w:cs="Times New Roman"/>
-              </w:rPr>
-              <m:t>diff</m:t>
-            </m:r>
-          </m:sub>
-        </m:sSub>
-      </m:oMath>
-      <w:r>
-        <w:rPr>
-          <w:rFonts w:ascii="Times New Roman" w:hAnsi="Times New Roman" w:cs="Times New Roman"/>
-        </w:rPr>
-        <w:t xml:space="preserve"> or smaller </w:t>
-      </w:r>
-      <m:oMath>
-        <m:r>
-          <m:rPr>
-            <m:sty m:val="p"/>
-          </m:rPr>
-          <w:rPr>
-            <w:rFonts w:ascii="Cambria Math" w:hAnsi="Cambria Math" w:cs="Times New Roman"/>
-          </w:rPr>
-          <m:t>Δ</m:t>
-        </m:r>
-        <m:sSub>
-          <m:sSubPr>
-            <m:ctrlPr>
-              <w:rPr>
-                <w:rFonts w:ascii="Cambria Math" w:hAnsi="Cambria Math" w:cs="Times New Roman"/>
-              </w:rPr>
-            </m:ctrlPr>
-          </m:sSubPr>
-          <m:e>
-            <m:r>
-              <w:rPr>
-                <w:rFonts w:ascii="Cambria Math" w:hAnsi="Cambria Math" w:cs="Times New Roman"/>
-              </w:rPr>
-              <m:t>t</m:t>
-            </m:r>
-          </m:e>
-          <m:sub>
-            <m:r>
-              <w:rPr>
-                <w:rFonts w:ascii="Cambria Math" w:hAnsi="Cambria Math" w:cs="Times New Roman"/>
-              </w:rPr>
-              <m:t>max</m:t>
-            </m:r>
-          </m:sub>
-        </m:sSub>
-      </m:oMath>
-      <w:r>
-        <w:rPr>
-          <w:rFonts w:ascii="Times New Roman" w:hAnsi="Times New Roman" w:cs="Times New Roman"/>
-        </w:rPr>
-        <w:t>) reduce iteration-to-iteration changes and prevent divergence, which becomes especially important as the wall-normal spacing is reduced by mesh stretching. Enforcing conservative CFL constraints keeps convective and diffusive updates stable in the smallest near-wall cells, at the cost of requiring more iterations to reach the final steady plateau.</w:t>
-      </w:r>
-    </w:p>
-    <w:p>
-      <w:pPr>
-        <w:rPr>
-          <w:rStyle w:val="Normal"/>
+      </w:r>
+      <w:r>
+        <w:rPr>
+          <w:rFonts w:ascii="Times New Roman" w:hAnsi="Times New Roman" w:cs="Times New Roman"/>
+        </w:rPr>
+        <w:t>The time step controls both stability and the path to steady state. Tighter limits reduce iteration-to-iteration changes and prevent divergence, which becomes especially important as the wall-normal spacing is reduced by mesh stretching. This was observed in the Fine mesh (15×40) case, which required much more restrictive settings to avoid instability. However, these conservative limits significantly increased runtime and can lead to very slow convergence or practical “non-convergence” within a reasonable step budget.</w:t>
+      </w:r>
+    </w:p>
+    <w:p>
+      <w:pPr>
+        <w:rPr>
           <w:rFonts w:ascii="Times New Roman" w:eastAsia="Times New Roman" w:hAnsi="Times New Roman" w:cs="Times New Roman"/>
           <w:snapToGrid w:val="0"/>
           <w:color w:val="000000"/>
@@ -8951,7 +9018,6 @@
     <w:p>
       <w:pPr>
         <w:rPr>
-          <w:rStyle w:val="Normal"/>
           <w:rFonts w:ascii="Times New Roman" w:eastAsia="Times New Roman" w:hAnsi="Times New Roman" w:cs="Times New Roman"/>
           <w:snapToGrid w:val="0"/>
           <w:color w:val="000000"/>
@@ -8970,7 +9036,6 @@
     <w:p>
       <w:pPr>
         <w:rPr>
-          <w:rStyle w:val="Normal"/>
           <w:rFonts w:ascii="Times New Roman" w:eastAsia="Times New Roman" w:hAnsi="Times New Roman" w:cs="Times New Roman"/>
           <w:snapToGrid w:val="0"/>
           <w:color w:val="000000"/>
@@ -8989,7 +9054,6 @@
     <w:p>
       <w:pPr>
         <w:rPr>
-          <w:rStyle w:val="Normal"/>
           <w:rFonts w:ascii="Times New Roman" w:eastAsia="Times New Roman" w:hAnsi="Times New Roman" w:cs="Times New Roman"/>
           <w:snapToGrid w:val="0"/>
           <w:color w:val="000000"/>
@@ -9008,7 +9072,6 @@
     <w:p>
       <w:pPr>
         <w:rPr>
-          <w:rStyle w:val="Normal"/>
           <w:rFonts w:ascii="Times New Roman" w:eastAsia="Times New Roman" w:hAnsi="Times New Roman" w:cs="Times New Roman"/>
           <w:snapToGrid w:val="0"/>
           <w:color w:val="000000"/>
@@ -9027,7 +9090,6 @@
     <w:p>
       <w:pPr>
         <w:rPr>
-          <w:rStyle w:val="Normal"/>
           <w:rFonts w:ascii="Times New Roman" w:eastAsia="Times New Roman" w:hAnsi="Times New Roman" w:cs="Times New Roman"/>
           <w:snapToGrid w:val="0"/>
           <w:color w:val="000000"/>
@@ -9046,7 +9108,6 @@
     <w:p>
       <w:pPr>
         <w:rPr>
-          <w:rStyle w:val="Normal"/>
           <w:rFonts w:ascii="Times New Roman" w:eastAsia="Times New Roman" w:hAnsi="Times New Roman" w:cs="Times New Roman"/>
           <w:snapToGrid w:val="0"/>
           <w:color w:val="000000"/>
@@ -9065,7 +9126,6 @@
     <w:p>
       <w:pPr>
         <w:rPr>
-          <w:rStyle w:val="Normal"/>
           <w:rFonts w:ascii="Times New Roman" w:eastAsia="Times New Roman" w:hAnsi="Times New Roman" w:cs="Times New Roman"/>
           <w:snapToGrid w:val="0"/>
           <w:color w:val="000000"/>
@@ -9084,7 +9144,6 @@
     <w:p>
       <w:pPr>
         <w:rPr>
-          <w:rStyle w:val="Normal"/>
           <w:rFonts w:ascii="Times New Roman" w:eastAsia="Times New Roman" w:hAnsi="Times New Roman" w:cs="Times New Roman"/>
           <w:snapToGrid w:val="0"/>
           <w:color w:val="000000"/>
@@ -9103,7 +9162,6 @@
     <w:p>
       <w:pPr>
         <w:rPr>
-          <w:rStyle w:val="Normal"/>
           <w:rFonts w:ascii="Times New Roman" w:eastAsia="Times New Roman" w:hAnsi="Times New Roman" w:cs="Times New Roman"/>
           <w:snapToGrid w:val="0"/>
           <w:color w:val="000000"/>
@@ -9122,7 +9180,6 @@
     <w:p>
       <w:pPr>
         <w:rPr>
-          <w:rStyle w:val="Normal"/>
           <w:rFonts w:ascii="Times New Roman" w:eastAsia="Times New Roman" w:hAnsi="Times New Roman" w:cs="Times New Roman"/>
           <w:snapToGrid w:val="0"/>
           <w:color w:val="000000"/>
@@ -9141,7 +9198,6 @@
     <w:p>
       <w:pPr>
         <w:rPr>
-          <w:rStyle w:val="Normal"/>
           <w:rFonts w:ascii="Times New Roman" w:eastAsia="Times New Roman" w:hAnsi="Times New Roman" w:cs="Times New Roman"/>
           <w:snapToGrid w:val="0"/>
           <w:color w:val="000000"/>
@@ -9160,7 +9216,6 @@
     <w:p>
       <w:pPr>
         <w:rPr>
-          <w:rStyle w:val="Normal"/>
           <w:rFonts w:ascii="Times New Roman" w:eastAsia="Times New Roman" w:hAnsi="Times New Roman" w:cs="Times New Roman"/>
           <w:snapToGrid w:val="0"/>
           <w:color w:val="000000"/>
@@ -9179,7 +9234,6 @@
     <w:p>
       <w:pPr>
         <w:rPr>
-          <w:rStyle w:val="Normal"/>
           <w:rFonts w:ascii="Times New Roman" w:eastAsia="Times New Roman" w:hAnsi="Times New Roman" w:cs="Times New Roman"/>
           <w:snapToGrid w:val="0"/>
           <w:color w:val="000000"/>

</xml_diff>